<commit_message>
fix: move Lab 1 module and documentation to backend repository
</commit_message>
<xml_diff>
--- a/docs/fuel_consumptions_lab1_report.docx
+++ b/docs/fuel_consumptions_lab1_report.docx
@@ -19,7 +19,7 @@
     </w:p>
     <w:p>
       <w:r>
-        <w:t>Автор: arseniy9606. ФИО: ____________________. Группа: ____________________. Репозиторий: cruisecontrol---front. Пространство имён: fuel_consumptions.</w:t>
+        <w:t>Автор: arseniy9606. ФИО: ____________________. Группа: ____________________. Репозиторий: cruisecontrol---back. Пространство имён: fuel_consumptions.</w:t>
       </w:r>
     </w:p>
     <w:p>
@@ -1402,12 +1402,12 @@
     </w:p>
     <w:p>
       <w:r>
-        <w:t>MinIO проверен в Docker: локально собранные образы из официальных исходников, восемь объектов в бакете fuel-consumptions. Код подготовлен в отдельной ветке lab1-fuel_consumptions репозитория cruisecontrol---front. Перед окончательной сдачей вписать ФИО/группу, импортировать SVG в Figma и сделать реальные снимки Network.</w:t>
+        <w:t>MinIO проверен в Docker: локально собранные образы из официальных исходников, восемь объектов в бакете fuel-consumptions. Код подготовлен в отдельной ветке lab1-fuel_consumptions репозитория cruisecontrol---back. Перед окончательной сдачей вписать ФИО/группу, импортировать SVG в Figma и сделать реальные снимки Network.</w:t>
       </w:r>
     </w:p>
     <w:p>
       <w:r>
-        <w:t>MinIO проверен в Docker на этом Mac. Недоступные готовые образы заменены сборкой из официальных закреплённых исходников. В бакете fuel-consumptions восемь объектов. Код подготовлен в ветке lab1-fuel_consumptions репозитория arseniy9606/cruisecontrol---front. Облачная Figma не изменена; её импорт и реальные снимки Network требуют отдельной проверки.</w:t>
+        <w:t>MinIO проверен в Docker на этом Mac. Недоступные готовые образы заменены сборкой из официальных закреплённых исходников. В бакете fuel-consumptions восемь объектов. Код подготовлен в ветке lab1-fuel_consumptions репозитория arseniy9606/cruisecontrol---back. Облачная Figma не изменена; её импорт и реальные снимки Network требуют отдельной проверки.</w:t>
       </w:r>
     </w:p>
     <w:p>

</xml_diff>